<commit_message>
Update portfolio profile and resume
Co-authored-by: Copilot <223556219+Copilot@users.noreply.github.com>
</commit_message>
<xml_diff>
--- a/Profile22/Profile/portfolio-website/portfolio-fullstack/Yaswanth_Kumar_Resume.docx
+++ b/Profile22/Profile/portfolio-website/portfolio-fullstack/Yaswanth_Kumar_Resume.docx
@@ -99,7 +99,7 @@
           <w:sz w:val="24"/>
           <w:szCs w:val="24"/>
         </w:rPr>
-        <w:t>yaswanthkumar2341@gmail.com</w:t>
+        <w:t>nyaswanthkumar93@gmail.com</w:t>
       </w:r>
       <w:r>
         <w:rPr>
@@ -309,6 +309,9 @@
           <w:t>https://nallagajula-yaswanth.vercel.app</w:t>
         </w:r>
       </w:hyperlink>
+      <w:r>
+        <w:t>/</w:t>
+      </w:r>
     </w:p>
     <w:p>
       <w:pPr>
@@ -412,7 +415,6 @@
           <w:lang w:val="en-IN"/>
         </w:rPr>
       </w:pPr>
-      <w:proofErr w:type="gramStart"/>
       <w:r>
         <w:rPr>
           <w:rFonts w:ascii="Times New Roman" w:hAnsi="Times New Roman" w:cs="Times New Roman"/>
@@ -421,9 +423,9 @@
           <w:w w:val="110"/>
           <w:lang w:val="en-IN"/>
         </w:rPr>
-        <w:t>B.Tech</w:t>
-      </w:r>
-      <w:proofErr w:type="gramEnd"/>
+        <w:t xml:space="preserve">B.Tech student in Electronics and Communication Engineering with hands-on experience in Python Full Stack Development. Proficient in Python, Django, HTML, CSS, JavaScript, SQL, and REST APIs. Skilled in developing responsive web applications, backend </w:t>
+      </w:r>
+      <w:proofErr w:type="spellStart"/>
       <w:r>
         <w:rPr>
           <w:rFonts w:ascii="Times New Roman" w:hAnsi="Times New Roman" w:cs="Times New Roman"/>
@@ -432,22 +434,9 @@
           <w:w w:val="110"/>
           <w:lang w:val="en-IN"/>
         </w:rPr>
-        <w:t xml:space="preserve"> student in Electronics and Communication Engineering with hands-on experience in Python Full Stack Development. Proficient in Python, Django, HTML, CSS, JavaScript, SQL, and REST APIs. Skilled in developing responsive web applications, backend </w:t>
-      </w:r>
-      <w:proofErr w:type="spellStart"/>
-      <w:proofErr w:type="gramStart"/>
-      <w:r>
-        <w:rPr>
-          <w:rFonts w:ascii="Times New Roman" w:hAnsi="Times New Roman" w:cs="Times New Roman"/>
-          <w:b w:val="0"/>
-          <w:bCs w:val="0"/>
-          <w:w w:val="110"/>
-          <w:lang w:val="en-IN"/>
-        </w:rPr>
         <w:t>development,database</w:t>
       </w:r>
       <w:proofErr w:type="spellEnd"/>
-      <w:proofErr w:type="gramEnd"/>
       <w:r>
         <w:rPr>
           <w:rFonts w:ascii="Times New Roman" w:hAnsi="Times New Roman" w:cs="Times New Roman"/>
@@ -561,7 +550,6 @@
           <w:szCs w:val="24"/>
         </w:rPr>
       </w:pPr>
-      <w:proofErr w:type="gramStart"/>
       <w:r>
         <w:rPr>
           <w:rFonts w:ascii="Times New Roman" w:hAnsi="Times New Roman" w:cs="Times New Roman"/>
@@ -570,18 +558,7 @@
           <w:sz w:val="24"/>
           <w:szCs w:val="24"/>
         </w:rPr>
-        <w:t>Dr.YC</w:t>
-      </w:r>
-      <w:proofErr w:type="gramEnd"/>
-      <w:r>
-        <w:rPr>
-          <w:rFonts w:ascii="Times New Roman" w:hAnsi="Times New Roman" w:cs="Times New Roman"/>
-          <w:b/>
-          <w:w w:val="130"/>
-          <w:sz w:val="24"/>
-          <w:szCs w:val="24"/>
-        </w:rPr>
-        <w:t xml:space="preserve"> James Yen govt polytechnic  </w:t>
+        <w:t xml:space="preserve">Dr.YC James Yen govt polytechnic  </w:t>
       </w:r>
     </w:p>
     <w:p>
@@ -638,23 +615,13 @@
           <w:szCs w:val="24"/>
         </w:rPr>
       </w:pPr>
-      <w:proofErr w:type="gramStart"/>
-      <w:r>
-        <w:rPr>
-          <w:rFonts w:ascii="Times New Roman" w:hAnsi="Times New Roman" w:cs="Times New Roman"/>
-          <w:sz w:val="24"/>
-          <w:szCs w:val="24"/>
-        </w:rPr>
-        <w:t>B.Tech</w:t>
-      </w:r>
-      <w:proofErr w:type="gramEnd"/>
-      <w:r>
-        <w:rPr>
-          <w:rFonts w:ascii="Times New Roman" w:hAnsi="Times New Roman" w:cs="Times New Roman"/>
-          <w:sz w:val="24"/>
-          <w:szCs w:val="24"/>
-        </w:rPr>
-        <w:t xml:space="preserve">                Pursuing                                                                                                                        2025 -202</w:t>
+      <w:r>
+        <w:rPr>
+          <w:rFonts w:ascii="Times New Roman" w:hAnsi="Times New Roman" w:cs="Times New Roman"/>
+          <w:sz w:val="24"/>
+          <w:szCs w:val="24"/>
+        </w:rPr>
+        <w:t>B.Tech                Pursuing                                                                                                                        2025 -202</w:t>
       </w:r>
       <w:r>
         <w:rPr>
@@ -1025,9 +992,8 @@
           <w:sz w:val="24"/>
           <w:szCs w:val="24"/>
         </w:rPr>
-        <w:t xml:space="preserve">         </w:t>
-      </w:r>
-      <w:proofErr w:type="gramStart"/>
+        <w:t xml:space="preserve">           </w:t>
+      </w:r>
       <w:r>
         <w:rPr>
           <w:rFonts w:ascii="Times New Roman" w:hAnsi="Times New Roman" w:cs="Times New Roman"/>
@@ -1037,20 +1003,8 @@
           <w:sz w:val="24"/>
           <w:szCs w:val="24"/>
         </w:rPr>
-        <w:t xml:space="preserve">  </w:t>
-      </w:r>
-      <w:r>
-        <w:rPr>
-          <w:rFonts w:ascii="Times New Roman" w:hAnsi="Times New Roman" w:cs="Times New Roman"/>
-          <w:b/>
-          <w:spacing w:val="-2"/>
-          <w:w w:val="115"/>
-          <w:sz w:val="24"/>
-          <w:szCs w:val="24"/>
-        </w:rPr>
         <w:t>:</w:t>
       </w:r>
-      <w:proofErr w:type="gramEnd"/>
       <w:r>
         <w:rPr>
           <w:rFonts w:ascii="Times New Roman" w:hAnsi="Times New Roman" w:cs="Times New Roman"/>
@@ -1149,7 +1103,6 @@
           <w:szCs w:val="24"/>
         </w:rPr>
       </w:pPr>
-      <w:proofErr w:type="gramStart"/>
       <w:r>
         <w:rPr>
           <w:rFonts w:ascii="Times New Roman" w:hAnsi="Times New Roman" w:cs="Times New Roman"/>
@@ -1168,17 +1121,7 @@
           <w:sz w:val="24"/>
           <w:szCs w:val="24"/>
         </w:rPr>
-        <w:t>AWS</w:t>
-      </w:r>
-      <w:proofErr w:type="gramEnd"/>
-      <w:r>
-        <w:rPr>
-          <w:rFonts w:ascii="Times New Roman" w:hAnsi="Times New Roman" w:cs="Times New Roman"/>
-          <w:w w:val="120"/>
-          <w:sz w:val="24"/>
-          <w:szCs w:val="24"/>
-        </w:rPr>
-        <w:t>,</w:t>
+        <w:t>AWS,</w:t>
       </w:r>
       <w:r>
         <w:rPr>
@@ -2085,27 +2028,7 @@
           <w:sz w:val="24"/>
           <w:szCs w:val="24"/>
         </w:rPr>
-        <w:t xml:space="preserve">Academic </w:t>
-      </w:r>
-      <w:proofErr w:type="gramStart"/>
-      <w:r>
-        <w:rPr>
-          <w:rFonts w:ascii="Times New Roman" w:hAnsi="Times New Roman" w:cs="Times New Roman"/>
-          <w:w w:val="115"/>
-          <w:sz w:val="24"/>
-          <w:szCs w:val="24"/>
-        </w:rPr>
-        <w:t>project  -</w:t>
-      </w:r>
-      <w:proofErr w:type="gramEnd"/>
-      <w:r>
-        <w:rPr>
-          <w:rFonts w:ascii="Times New Roman" w:hAnsi="Times New Roman" w:cs="Times New Roman"/>
-          <w:w w:val="115"/>
-          <w:sz w:val="24"/>
-          <w:szCs w:val="24"/>
-        </w:rPr>
-        <w:t xml:space="preserve">  -V</w:t>
+        <w:t>Academic project  -  -V</w:t>
       </w:r>
       <w:r>
         <w:rPr>
@@ -2466,51 +2389,15 @@
           <w:sz w:val="24"/>
           <w:szCs w:val="24"/>
         </w:rPr>
-        <w:t xml:space="preserve">Arduino </w:t>
-      </w:r>
-      <w:proofErr w:type="gramStart"/>
-      <w:r>
-        <w:rPr>
-          <w:rFonts w:ascii="Times New Roman" w:hAnsi="Times New Roman" w:cs="Times New Roman"/>
-          <w:sz w:val="24"/>
-          <w:szCs w:val="24"/>
-        </w:rPr>
-        <w:t xml:space="preserve">RF </w:t>
-      </w:r>
-      <w:r>
-        <w:rPr>
-          <w:rFonts w:ascii="Times New Roman" w:hAnsi="Times New Roman" w:cs="Times New Roman"/>
-          <w:sz w:val="24"/>
-          <w:szCs w:val="24"/>
-        </w:rPr>
-        <w:t xml:space="preserve"> modules</w:t>
-      </w:r>
-      <w:proofErr w:type="gramEnd"/>
-      <w:r>
-        <w:rPr>
-          <w:rFonts w:ascii="Times New Roman" w:hAnsi="Times New Roman" w:cs="Times New Roman"/>
-          <w:sz w:val="24"/>
-          <w:szCs w:val="24"/>
-        </w:rPr>
-        <w:t xml:space="preserve">,and a DC motor, </w:t>
-      </w:r>
-      <w:proofErr w:type="gramStart"/>
-      <w:r>
-        <w:rPr>
-          <w:rFonts w:ascii="Times New Roman" w:hAnsi="Times New Roman" w:cs="Times New Roman"/>
-          <w:sz w:val="24"/>
-          <w:szCs w:val="24"/>
-        </w:rPr>
-        <w:t>so  it</w:t>
-      </w:r>
-      <w:proofErr w:type="gramEnd"/>
-      <w:r>
-        <w:rPr>
-          <w:rFonts w:ascii="Times New Roman" w:hAnsi="Times New Roman" w:cs="Times New Roman"/>
-          <w:sz w:val="24"/>
-          <w:szCs w:val="24"/>
-        </w:rPr>
-        <w:t xml:space="preserve"> is affordable and easy to install </w:t>
+        <w:t xml:space="preserve">Arduino RF </w:t>
+      </w:r>
+      <w:r>
+        <w:rPr>
+          <w:rFonts w:ascii="Times New Roman" w:hAnsi="Times New Roman" w:cs="Times New Roman"/>
+          <w:sz w:val="24"/>
+          <w:szCs w:val="24"/>
+        </w:rPr>
+        <w:t xml:space="preserve"> modules,and a DC motor, so  it is affordable and easy to install </w:t>
       </w:r>
     </w:p>
     <w:p>
@@ -2895,33 +2782,15 @@
           <w:sz w:val="24"/>
           <w:szCs w:val="24"/>
         </w:rPr>
-        <w:t xml:space="preserve">Free webinar on “data </w:t>
-      </w:r>
-      <w:proofErr w:type="gramStart"/>
-      <w:r>
-        <w:rPr>
-          <w:rFonts w:ascii="Times New Roman" w:hAnsi="Times New Roman" w:cs="Times New Roman"/>
-          <w:sz w:val="24"/>
-          <w:szCs w:val="24"/>
-        </w:rPr>
-        <w:t xml:space="preserve">structures”  </w:t>
-      </w:r>
-      <w:r>
-        <w:rPr>
-          <w:rFonts w:ascii="Times New Roman" w:hAnsi="Times New Roman" w:cs="Times New Roman"/>
-          <w:sz w:val="24"/>
-          <w:szCs w:val="24"/>
-        </w:rPr>
-        <w:t xml:space="preserve"> </w:t>
-      </w:r>
-      <w:proofErr w:type="gramEnd"/>
-      <w:r>
-        <w:rPr>
-          <w:rFonts w:ascii="Times New Roman" w:hAnsi="Times New Roman" w:cs="Times New Roman"/>
-          <w:sz w:val="24"/>
-          <w:szCs w:val="24"/>
-        </w:rPr>
-        <w:t>course, MAANG CAREERS, Hyderabad</w:t>
+        <w:t xml:space="preserve">Free webinar on “data structures”  </w:t>
+      </w:r>
+      <w:r>
+        <w:rPr>
+          <w:rFonts w:ascii="Times New Roman" w:hAnsi="Times New Roman" w:cs="Times New Roman"/>
+          <w:sz w:val="24"/>
+          <w:szCs w:val="24"/>
+        </w:rPr>
+        <w:t xml:space="preserve"> course, MAANG CAREERS, Hyderabad</w:t>
       </w:r>
       <w:r>
         <w:rPr>
@@ -2956,25 +2825,7 @@
           <w:sz w:val="24"/>
           <w:szCs w:val="24"/>
         </w:rPr>
-        <w:t xml:space="preserve">Interview </w:t>
-      </w:r>
-      <w:proofErr w:type="gramStart"/>
-      <w:r>
-        <w:rPr>
-          <w:rFonts w:ascii="Times New Roman" w:hAnsi="Times New Roman" w:cs="Times New Roman"/>
-          <w:sz w:val="24"/>
-          <w:szCs w:val="24"/>
-        </w:rPr>
-        <w:t>preparation  course</w:t>
-      </w:r>
-      <w:proofErr w:type="gramEnd"/>
-      <w:r>
-        <w:rPr>
-          <w:rFonts w:ascii="Times New Roman" w:hAnsi="Times New Roman" w:cs="Times New Roman"/>
-          <w:sz w:val="24"/>
-          <w:szCs w:val="24"/>
-        </w:rPr>
-        <w:t xml:space="preserve"> (fast track) </w:t>
+        <w:t xml:space="preserve">Interview preparation  course (fast track) </w:t>
       </w:r>
       <w:r>
         <w:rPr>
@@ -3017,16 +2868,7 @@
           <w:sz w:val="24"/>
           <w:szCs w:val="24"/>
         </w:rPr>
-        <w:t xml:space="preserve">Web developer </w:t>
-      </w:r>
-      <w:proofErr w:type="gramStart"/>
-      <w:r>
-        <w:rPr>
-          <w:rFonts w:ascii="Times New Roman" w:hAnsi="Times New Roman" w:cs="Times New Roman"/>
-          <w:sz w:val="24"/>
-          <w:szCs w:val="24"/>
-        </w:rPr>
-        <w:t>course</w:t>
+        <w:t>Web developer course</w:t>
       </w:r>
       <w:r>
         <w:rPr>
@@ -3042,34 +2884,7 @@
           <w:sz w:val="24"/>
           <w:szCs w:val="24"/>
         </w:rPr>
-        <w:t xml:space="preserve"> Skill</w:t>
-      </w:r>
-      <w:proofErr w:type="gramEnd"/>
-      <w:r>
-        <w:rPr>
-          <w:rFonts w:ascii="Times New Roman" w:hAnsi="Times New Roman" w:cs="Times New Roman"/>
-          <w:sz w:val="24"/>
-          <w:szCs w:val="24"/>
-        </w:rPr>
-        <w:t xml:space="preserve"> </w:t>
-      </w:r>
-      <w:proofErr w:type="gramStart"/>
-      <w:r>
-        <w:rPr>
-          <w:rFonts w:ascii="Times New Roman" w:hAnsi="Times New Roman" w:cs="Times New Roman"/>
-          <w:sz w:val="24"/>
-          <w:szCs w:val="24"/>
-        </w:rPr>
-        <w:t>AP  (</w:t>
-      </w:r>
-      <w:proofErr w:type="gramEnd"/>
-      <w:r>
-        <w:rPr>
-          <w:rFonts w:ascii="Times New Roman" w:hAnsi="Times New Roman" w:cs="Times New Roman"/>
-          <w:sz w:val="24"/>
-          <w:szCs w:val="24"/>
-        </w:rPr>
-        <w:t xml:space="preserve">APSSDC), kuppam                                                           </w:t>
+        <w:t xml:space="preserve"> Skill AP  (APSSDC), kuppam                                                           </w:t>
       </w:r>
       <w:r>
         <w:rPr>
@@ -3120,25 +2935,7 @@
           <w:sz w:val="24"/>
           <w:szCs w:val="24"/>
         </w:rPr>
-        <w:t xml:space="preserve"> software </w:t>
-      </w:r>
-      <w:proofErr w:type="gramStart"/>
-      <w:r>
-        <w:rPr>
-          <w:rFonts w:ascii="Times New Roman" w:hAnsi="Times New Roman" w:cs="Times New Roman"/>
-          <w:sz w:val="24"/>
-          <w:szCs w:val="24"/>
-        </w:rPr>
-        <w:t>solutions,bengalore</w:t>
-      </w:r>
-      <w:proofErr w:type="gramEnd"/>
-      <w:r>
-        <w:rPr>
-          <w:rFonts w:ascii="Times New Roman" w:hAnsi="Times New Roman" w:cs="Times New Roman"/>
-          <w:sz w:val="24"/>
-          <w:szCs w:val="24"/>
-        </w:rPr>
-        <w:t xml:space="preserve">          </w:t>
+        <w:t xml:space="preserve"> software solutions,bengalore          </w:t>
       </w:r>
       <w:r>
         <w:rPr>
@@ -3154,33 +2951,15 @@
           <w:sz w:val="24"/>
           <w:szCs w:val="24"/>
         </w:rPr>
-        <w:t xml:space="preserve"> </w:t>
-      </w:r>
-      <w:proofErr w:type="gramStart"/>
-      <w:r>
-        <w:rPr>
-          <w:rFonts w:ascii="Times New Roman" w:hAnsi="Times New Roman" w:cs="Times New Roman"/>
-          <w:sz w:val="24"/>
-          <w:szCs w:val="24"/>
-        </w:rPr>
-        <w:t xml:space="preserve">- </w:t>
-      </w:r>
-      <w:r>
-        <w:rPr>
-          <w:rFonts w:ascii="Times New Roman" w:hAnsi="Times New Roman" w:cs="Times New Roman"/>
-          <w:sz w:val="24"/>
-          <w:szCs w:val="24"/>
-        </w:rPr>
-        <w:t xml:space="preserve"> September</w:t>
-      </w:r>
-      <w:proofErr w:type="gramEnd"/>
-      <w:r>
-        <w:rPr>
-          <w:rFonts w:ascii="Times New Roman" w:hAnsi="Times New Roman" w:cs="Times New Roman"/>
-          <w:sz w:val="24"/>
-          <w:szCs w:val="24"/>
-        </w:rPr>
-        <w:t xml:space="preserve">  2025</w:t>
+        <w:t xml:space="preserve"> - </w:t>
+      </w:r>
+      <w:r>
+        <w:rPr>
+          <w:rFonts w:ascii="Times New Roman" w:hAnsi="Times New Roman" w:cs="Times New Roman"/>
+          <w:sz w:val="24"/>
+          <w:szCs w:val="24"/>
+        </w:rPr>
+        <w:t xml:space="preserve"> September  2025</w:t>
       </w:r>
       <w:r>
         <w:rPr>
@@ -4922,10 +4701,6 @@
 </file>
 
 <file path=customXml/item1.xml><?xml version="1.0" encoding="utf-8"?>
-<b:Sources xmlns:b="http://schemas.openxmlformats.org/officeDocument/2006/bibliography" xmlns="http://schemas.openxmlformats.org/officeDocument/2006/bibliography" SelectedStyle="\APASixthEditionOfficeOnline.xsl" StyleName="APA" Version="6"/>
-</file>
-
-<file path=customXml/item2.xml><?xml version="1.0" encoding="utf-8"?>
 <s:customData xmlns="http://www.wps.cn/officeDocument/2013/wpsCustomData" xmlns:s="http://www.wps.cn/officeDocument/2013/wpsCustomData">
   <customSectProps/>
   <customShpExts>
@@ -4934,18 +4709,22 @@
 </s:customData>
 </file>
 
+<file path=customXml/item2.xml><?xml version="1.0" encoding="utf-8"?>
+<b:Sources xmlns:b="http://schemas.openxmlformats.org/officeDocument/2006/bibliography" xmlns="http://schemas.openxmlformats.org/officeDocument/2006/bibliography" SelectedStyle="\APASixthEditionOfficeOnline.xsl" StyleName="APA" Version="6"/>
+</file>
+
 <file path=customXml/itemProps1.xml><?xml version="1.0" encoding="utf-8"?>
+<ds:datastoreItem xmlns:ds="http://schemas.openxmlformats.org/officeDocument/2006/customXml" ds:itemID="{B1977F7D-205B-4081-913C-38D41E755F92}">
+  <ds:schemaRefs>
+    <ds:schemaRef ds:uri="http://www.wps.cn/officeDocument/2013/wpsCustomData"/>
+  </ds:schemaRefs>
+</ds:datastoreItem>
+</file>
+
+<file path=customXml/itemProps2.xml><?xml version="1.0" encoding="utf-8"?>
 <ds:datastoreItem xmlns:ds="http://schemas.openxmlformats.org/officeDocument/2006/customXml" ds:itemID="{049DA9FC-1F5B-4A7C-A064-F83E2C896798}">
   <ds:schemaRefs>
     <ds:schemaRef ds:uri="http://schemas.openxmlformats.org/officeDocument/2006/bibliography"/>
   </ds:schemaRefs>
 </ds:datastoreItem>
-</file>
-
-<file path=customXml/itemProps2.xml><?xml version="1.0" encoding="utf-8"?>
-<ds:datastoreItem xmlns:ds="http://schemas.openxmlformats.org/officeDocument/2006/customXml" ds:itemID="{B1977F7D-205B-4081-913C-38D41E755F92}">
-  <ds:schemaRefs>
-    <ds:schemaRef ds:uri="http://www.wps.cn/officeDocument/2013/wpsCustomData"/>
-  </ds:schemaRefs>
-</ds:datastoreItem>
 </file>
</xml_diff>